<commit_message>
séance du 11 juin 2026 2
</commit_message>
<xml_diff>
--- a/Phase de Definition 2.docx
+++ b/Phase de Definition 2.docx
@@ -1,6 +1,6 @@
 
 <file path=word/document.xml><?xml version="1.0" encoding="utf-8"?>
-<w:document xmlns:wpc="http://schemas.microsoft.com/office/word/2010/wordprocessingCanvas" xmlns:cx="http://schemas.microsoft.com/office/drawing/2014/chartex" xmlns:cx1="http://schemas.microsoft.com/office/drawing/2015/9/8/chartex" xmlns:cx2="http://schemas.microsoft.com/office/drawing/2015/10/21/chartex" xmlns:cx3="http://schemas.microsoft.com/office/drawing/2016/5/9/chartex" xmlns:cx4="http://schemas.microsoft.com/office/drawing/2016/5/10/chartex" xmlns:cx5="http://schemas.microsoft.com/office/drawing/2016/5/11/chartex" xmlns:cx6="http://schemas.microsoft.com/office/drawing/2016/5/12/chartex" xmlns:cx7="http://schemas.microsoft.com/office/drawing/2016/5/13/chartex" xmlns:cx8="http://schemas.microsoft.com/office/drawing/2016/5/14/chartex" xmlns:mc="http://schemas.openxmlformats.org/markup-compatibility/2006" xmlns:aink="http://schemas.microsoft.com/office/drawing/2016/ink" xmlns:am3d="http://schemas.microsoft.com/office/drawing/2017/model3d" xmlns:o="urn:schemas-microsoft-com:office:office" xmlns:r="http://schemas.openxmlformats.org/officeDocument/2006/relationships" xmlns:m="http://schemas.openxmlformats.org/officeDocument/2006/math" xmlns:v="urn:schemas-microsoft-com:vml" xmlns:wp14="http://schemas.microsoft.com/office/word/2010/wordprocessingDrawing" xmlns:wp="http://schemas.openxmlformats.org/drawingml/2006/wordprocessingDrawing" xmlns:w10="urn:schemas-microsoft-com:office:word" xmlns:w="http://schemas.openxmlformats.org/wordprocessingml/2006/main" xmlns:w14="http://schemas.microsoft.com/office/word/2010/wordml" xmlns:w15="http://schemas.microsoft.com/office/word/2012/wordml" xmlns:w16cid="http://schemas.microsoft.com/office/word/2016/wordml/cid" xmlns:w16se="http://schemas.microsoft.com/office/word/2015/wordml/symex" xmlns:wpg="http://schemas.microsoft.com/office/word/2010/wordprocessingGroup" xmlns:wpi="http://schemas.microsoft.com/office/word/2010/wordprocessingInk" xmlns:wne="http://schemas.microsoft.com/office/word/2006/wordml" xmlns:wps="http://schemas.microsoft.com/office/word/2010/wordprocessingShape" mc:Ignorable="w14 w15 w16se w16cid wp14">
+<w:document xmlns:wpc="http://schemas.microsoft.com/office/word/2010/wordprocessingCanvas" xmlns:cx="http://schemas.microsoft.com/office/drawing/2014/chartex" xmlns:cx1="http://schemas.microsoft.com/office/drawing/2015/9/8/chartex" xmlns:mc="http://schemas.openxmlformats.org/markup-compatibility/2006" xmlns:o="urn:schemas-microsoft-com:office:office" xmlns:r="http://schemas.openxmlformats.org/officeDocument/2006/relationships" xmlns:m="http://schemas.openxmlformats.org/officeDocument/2006/math" xmlns:v="urn:schemas-microsoft-com:vml" xmlns:wp14="http://schemas.microsoft.com/office/word/2010/wordprocessingDrawing" xmlns:wp="http://schemas.openxmlformats.org/drawingml/2006/wordprocessingDrawing" xmlns:w10="urn:schemas-microsoft-com:office:word" xmlns:w="http://schemas.openxmlformats.org/wordprocessingml/2006/main" xmlns:w14="http://schemas.microsoft.com/office/word/2010/wordml" xmlns:w15="http://schemas.microsoft.com/office/word/2012/wordml" xmlns:w16se="http://schemas.microsoft.com/office/word/2015/wordml/symex" xmlns:wpg="http://schemas.microsoft.com/office/word/2010/wordprocessingGroup" xmlns:wpi="http://schemas.microsoft.com/office/word/2010/wordprocessingInk" xmlns:wne="http://schemas.microsoft.com/office/word/2006/wordml" xmlns:wps="http://schemas.microsoft.com/office/word/2010/wordprocessingShape" mc:Ignorable="w14 w15 w16se wp14">
   <w:body>
     <w:tbl>
       <w:tblPr>
@@ -51,15 +51,7 @@
                 <w:sz w:val="17"/>
                 <w:szCs w:val="17"/>
               </w:rPr>
-              <w:t xml:space="preserve">MÉMOIRE — UFR SATIC · Université </w:t>
-            </w:r>
-            <w:r>
-              <w:rPr>
-                <w:color w:val="A8C8E8"/>
-                <w:sz w:val="17"/>
-                <w:szCs w:val="17"/>
-              </w:rPr>
-              <w:t>Alioune Diop de Bambey</w:t>
+              <w:t>MÉMOIRE — UFR SATIC · Université Alioune Diop de Bambey</w:t>
             </w:r>
           </w:p>
           <w:p>
@@ -158,13 +150,7 @@
         <w:rPr>
           <w:color w:val="1A2638"/>
         </w:rPr>
-        <w:t xml:space="preserve">Six </w:t>
-      </w:r>
-      <w:r>
-        <w:rPr>
-          <w:color w:val="1A2638"/>
-        </w:rPr>
-        <w:t>thèmes émergents issus des entretiens menés auprès des quatre groupes de parties prenantes (administration/scolarité, enseignants/surveillants, service informatique, étudiants — Phase Understanding, mai 2025).</w:t>
+        <w:t>Six thèmes émergents issus des entretiens menés auprès des quatre groupes de parties prenantes (administration/scolarité, enseignants/surveillants, service informatique, étudiants — Phase Understanding, mai 2025).</w:t>
       </w:r>
     </w:p>
     <w:p>
@@ -256,8 +242,34 @@
                 <w:sz w:val="18"/>
                 <w:szCs w:val="18"/>
               </w:rPr>
-              <w:t>DONNÉES ISSUES DES ENTRETIENS DE TERRAI</w:t>
-            </w:r>
+              <w:t>DONNÉES ISSUES DES ENTRETIENS DE TERRAIN</w:t>
+            </w:r>
+          </w:p>
+        </w:tc>
+      </w:tr>
+      <w:tr>
+        <w:tc>
+          <w:tcPr>
+            <w:tcW w:w="2040" w:type="dxa"/>
+            <w:tcBorders>
+              <w:top w:val="single" w:sz="0" w:space="0" w:color="CCCCCC"/>
+              <w:left w:val="single" w:sz="0" w:space="0" w:color="CCCCCC"/>
+              <w:bottom w:val="single" w:sz="0" w:space="0" w:color="CCCCCC"/>
+              <w:right w:val="single" w:sz="0" w:space="0" w:color="CCCCCC"/>
+            </w:tcBorders>
+            <w:shd w:val="clear" w:color="auto" w:fill="C05820"/>
+            <w:tcMar>
+              <w:top w:w="90" w:type="dxa"/>
+              <w:left w:w="130" w:type="dxa"/>
+              <w:bottom w:w="90" w:type="dxa"/>
+              <w:right w:w="130" w:type="dxa"/>
+            </w:tcMar>
+            <w:vAlign w:val="center"/>
+          </w:tcPr>
+          <w:p>
+            <w:pPr>
+              <w:jc w:val="center"/>
+            </w:pPr>
             <w:r>
               <w:rPr>
                 <w:b/>
@@ -266,7 +278,35 @@
                 <w:sz w:val="18"/>
                 <w:szCs w:val="18"/>
               </w:rPr>
-              <w:t>N</w:t>
+              <w:t>FRAUDE</w:t>
+            </w:r>
+          </w:p>
+        </w:tc>
+        <w:tc>
+          <w:tcPr>
+            <w:tcW w:w="7320" w:type="dxa"/>
+            <w:tcBorders>
+              <w:top w:val="single" w:sz="0" w:space="0" w:color="CCCCCC"/>
+              <w:left w:val="single" w:sz="0" w:space="0" w:color="CCCCCC"/>
+              <w:bottom w:val="single" w:sz="0" w:space="0" w:color="CCCCCC"/>
+              <w:right w:val="single" w:sz="0" w:space="0" w:color="CCCCCC"/>
+            </w:tcBorders>
+            <w:shd w:val="clear" w:color="auto" w:fill="F5F7FA"/>
+            <w:tcMar>
+              <w:top w:w="90" w:type="dxa"/>
+              <w:left w:w="130" w:type="dxa"/>
+              <w:bottom w:w="90" w:type="dxa"/>
+              <w:right w:w="130" w:type="dxa"/>
+            </w:tcMar>
+          </w:tcPr>
+          <w:p>
+            <w:r>
+              <w:rPr>
+                <w:color w:val="1A2638"/>
+                <w:sz w:val="18"/>
+                <w:szCs w:val="18"/>
+              </w:rPr>
+              <w:t>~10 cas officiels/session (sous-estimés selon témoignages étudiants) · Intercalaires pré-remplis, téléphone portable, discussion entre étudiants, sortie avec le sujet pour le traiter et revenir · Ratio insuffisant en amphi 300-500 = détection quasi impossible</w:t>
             </w:r>
           </w:p>
         </w:tc>
@@ -281,7 +321,7 @@
               <w:bottom w:val="single" w:sz="0" w:space="0" w:color="CCCCCC"/>
               <w:right w:val="single" w:sz="0" w:space="0" w:color="CCCCCC"/>
             </w:tcBorders>
-            <w:shd w:val="clear" w:color="auto" w:fill="C05820"/>
+            <w:shd w:val="clear" w:color="auto" w:fill="2E6DA4"/>
             <w:tcMar>
               <w:top w:w="90" w:type="dxa"/>
               <w:left w:w="130" w:type="dxa"/>
@@ -302,7 +342,7 @@
                 <w:sz w:val="18"/>
                 <w:szCs w:val="18"/>
               </w:rPr>
-              <w:t>FRAUDE</w:t>
+              <w:t>SURVEILLANCE</w:t>
             </w:r>
           </w:p>
         </w:tc>
@@ -330,15 +370,71 @@
                 <w:sz w:val="18"/>
                 <w:szCs w:val="18"/>
               </w:rPr>
-              <w:t>~10 cas officiels/session (sous-estimés selon témoignages étudiants) · Intercalaires pré-remplis, téléphone portable, discussion entre étudiants, sortie avec le sujet pour le traiter et revenir · Ratio insuffisant en amphi 300-500 = détection qua</w:t>
-            </w:r>
+              <w:t>20 surveillants/session · 2-3 pour 60-80 étudiants, 5-6 pour 300-500 · Retards fréquents, manque de rigueur, absence de formation · Difficulté de joindre l'enseignant en cas d'erreur sur le sujet · Gestion centralisée à la scolarité</w:t>
+            </w:r>
+          </w:p>
+        </w:tc>
+      </w:tr>
+      <w:tr>
+        <w:tc>
+          <w:tcPr>
+            <w:tcW w:w="2040" w:type="dxa"/>
+            <w:tcBorders>
+              <w:top w:val="single" w:sz="0" w:space="0" w:color="CCCCCC"/>
+              <w:left w:val="single" w:sz="0" w:space="0" w:color="CCCCCC"/>
+              <w:bottom w:val="single" w:sz="0" w:space="0" w:color="CCCCCC"/>
+              <w:right w:val="single" w:sz="0" w:space="0" w:color="CCCCCC"/>
+            </w:tcBorders>
+            <w:shd w:val="clear" w:color="auto" w:fill="2E7D6E"/>
+            <w:tcMar>
+              <w:top w:w="90" w:type="dxa"/>
+              <w:left w:w="130" w:type="dxa"/>
+              <w:bottom w:w="90" w:type="dxa"/>
+              <w:right w:w="130" w:type="dxa"/>
+            </w:tcMar>
+            <w:vAlign w:val="center"/>
+          </w:tcPr>
+          <w:p>
+            <w:pPr>
+              <w:jc w:val="center"/>
+            </w:pPr>
+            <w:r>
+              <w:rPr>
+                <w:b/>
+                <w:bCs/>
+                <w:color w:val="FFFFFF"/>
+                <w:sz w:val="18"/>
+                <w:szCs w:val="18"/>
+              </w:rPr>
+              <w:t>INFRASTRUCTURE</w:t>
+            </w:r>
+          </w:p>
+        </w:tc>
+        <w:tc>
+          <w:tcPr>
+            <w:tcW w:w="7320" w:type="dxa"/>
+            <w:tcBorders>
+              <w:top w:val="single" w:sz="0" w:space="0" w:color="CCCCCC"/>
+              <w:left w:val="single" w:sz="0" w:space="0" w:color="CCCCCC"/>
+              <w:bottom w:val="single" w:sz="0" w:space="0" w:color="CCCCCC"/>
+              <w:right w:val="single" w:sz="0" w:space="0" w:color="CCCCCC"/>
+            </w:tcBorders>
+            <w:shd w:val="clear" w:color="auto" w:fill="F5F7FA"/>
+            <w:tcMar>
+              <w:top w:w="90" w:type="dxa"/>
+              <w:left w:w="130" w:type="dxa"/>
+              <w:bottom w:w="90" w:type="dxa"/>
+              <w:right w:w="130" w:type="dxa"/>
+            </w:tcMar>
+          </w:tcPr>
+          <w:p>
             <w:r>
               <w:rPr>
                 <w:color w:val="1A2638"/>
                 <w:sz w:val="18"/>
                 <w:szCs w:val="18"/>
               </w:rPr>
-              <w:t>si impossible</w:t>
+              <w:t>Caméras déjà installées mais NON FONCTIONNELLES · Infrastructure réseau mutualisée (SONATEL + SENUM) · Équipements informatiques disponibles (tous types) · Maintenance interne préventive et curative assurée par le service informatique</w:t>
             </w:r>
           </w:p>
         </w:tc>
@@ -353,7 +449,7 @@
               <w:bottom w:val="single" w:sz="0" w:space="0" w:color="CCCCCC"/>
               <w:right w:val="single" w:sz="0" w:space="0" w:color="CCCCCC"/>
             </w:tcBorders>
-            <w:shd w:val="clear" w:color="auto" w:fill="2E6DA4"/>
+            <w:shd w:val="clear" w:color="auto" w:fill="A03030"/>
             <w:tcMar>
               <w:top w:w="90" w:type="dxa"/>
               <w:left w:w="130" w:type="dxa"/>
@@ -374,7 +470,7 @@
                 <w:sz w:val="18"/>
                 <w:szCs w:val="18"/>
               </w:rPr>
-              <w:t>SURVEILLANCE</w:t>
+              <w:t>FINANCES</w:t>
             </w:r>
           </w:p>
         </w:tc>
@@ -402,15 +498,71 @@
                 <w:sz w:val="18"/>
                 <w:szCs w:val="18"/>
               </w:rPr>
-              <w:t xml:space="preserve">20 surveillants/session · 2-3 pour 60-80 étudiants, 5-6 pour 300-500 · Retards fréquents, manque de rigueur, absence de formation · Difficulté de joindre l'enseignant en cas d'erreur sur le sujet · Gestion centralisée à la </w:t>
-            </w:r>
+              <w:t>200 000 FCFA/surveillant/semestre · ~4 000 000 FCFA pour 20 surveillants/session · Budget télésurveillance : inconnu à ce stade · Aucune étude de coût initiée · Financement = premier obstacle cité par l'administration</w:t>
+            </w:r>
+          </w:p>
+        </w:tc>
+      </w:tr>
+      <w:tr>
+        <w:tc>
+          <w:tcPr>
+            <w:tcW w:w="2040" w:type="dxa"/>
+            <w:tcBorders>
+              <w:top w:val="single" w:sz="0" w:space="0" w:color="CCCCCC"/>
+              <w:left w:val="single" w:sz="0" w:space="0" w:color="CCCCCC"/>
+              <w:bottom w:val="single" w:sz="0" w:space="0" w:color="CCCCCC"/>
+              <w:right w:val="single" w:sz="0" w:space="0" w:color="CCCCCC"/>
+            </w:tcBorders>
+            <w:shd w:val="clear" w:color="auto" w:fill="5E4A8A"/>
+            <w:tcMar>
+              <w:top w:w="90" w:type="dxa"/>
+              <w:left w:w="130" w:type="dxa"/>
+              <w:bottom w:w="90" w:type="dxa"/>
+              <w:right w:w="130" w:type="dxa"/>
+            </w:tcMar>
+            <w:vAlign w:val="center"/>
+          </w:tcPr>
+          <w:p>
+            <w:pPr>
+              <w:jc w:val="center"/>
+            </w:pPr>
+            <w:r>
+              <w:rPr>
+                <w:b/>
+                <w:bCs/>
+                <w:color w:val="FFFFFF"/>
+                <w:sz w:val="18"/>
+                <w:szCs w:val="18"/>
+              </w:rPr>
+              <w:t>ÉTHIQUE &amp; CADRE</w:t>
+            </w:r>
+          </w:p>
+        </w:tc>
+        <w:tc>
+          <w:tcPr>
+            <w:tcW w:w="7320" w:type="dxa"/>
+            <w:tcBorders>
+              <w:top w:val="single" w:sz="0" w:space="0" w:color="CCCCCC"/>
+              <w:left w:val="single" w:sz="0" w:space="0" w:color="CCCCCC"/>
+              <w:bottom w:val="single" w:sz="0" w:space="0" w:color="CCCCCC"/>
+              <w:right w:val="single" w:sz="0" w:space="0" w:color="CCCCCC"/>
+            </w:tcBorders>
+            <w:shd w:val="clear" w:color="auto" w:fill="F5F7FA"/>
+            <w:tcMar>
+              <w:top w:w="90" w:type="dxa"/>
+              <w:left w:w="130" w:type="dxa"/>
+              <w:bottom w:w="90" w:type="dxa"/>
+              <w:right w:w="130" w:type="dxa"/>
+            </w:tcMar>
+          </w:tcPr>
+          <w:p>
             <w:r>
               <w:rPr>
                 <w:color w:val="1A2638"/>
                 <w:sz w:val="18"/>
                 <w:szCs w:val="18"/>
               </w:rPr>
-              <w:t>scolarité</w:t>
+              <w:t>Nécessité d'autorisation du rectorat + directeur d'UFR · Consentement des étudiants et enseignants requis · Conformité réglementation nationale sur la vidéosurveillance · Hébergement et protection des données non traités institutionnellement</w:t>
             </w:r>
           </w:p>
         </w:tc>
@@ -425,7 +577,7 @@
               <w:bottom w:val="single" w:sz="0" w:space="0" w:color="CCCCCC"/>
               <w:right w:val="single" w:sz="0" w:space="0" w:color="CCCCCC"/>
             </w:tcBorders>
-            <w:shd w:val="clear" w:color="auto" w:fill="2E7D6E"/>
+            <w:shd w:val="clear" w:color="auto" w:fill="3A6E4A"/>
             <w:tcMar>
               <w:top w:w="90" w:type="dxa"/>
               <w:left w:w="130" w:type="dxa"/>
@@ -446,7 +598,7 @@
                 <w:sz w:val="18"/>
                 <w:szCs w:val="18"/>
               </w:rPr>
-              <w:t>INFRASTRUCTURE</w:t>
+              <w:t>ACCEPTABILITÉ</w:t>
             </w:r>
           </w:p>
         </w:tc>
@@ -474,225 +626,7 @@
                 <w:sz w:val="18"/>
                 <w:szCs w:val="18"/>
               </w:rPr>
-              <w:t xml:space="preserve">Caméras déjà installées mais NON FONCTIONNELLES · Infrastructure réseau mutualisée (SONATEL + SENUM) · Équipements informatiques disponibles (tous types) · Maintenance interne préventive et curative assurée par le service </w:t>
-            </w:r>
-            <w:r>
-              <w:rPr>
-                <w:color w:val="1A2638"/>
-                <w:sz w:val="18"/>
-                <w:szCs w:val="18"/>
-              </w:rPr>
-              <w:t>informatique</w:t>
-            </w:r>
-          </w:p>
-        </w:tc>
-      </w:tr>
-      <w:tr>
-        <w:tc>
-          <w:tcPr>
-            <w:tcW w:w="2040" w:type="dxa"/>
-            <w:tcBorders>
-              <w:top w:val="single" w:sz="0" w:space="0" w:color="CCCCCC"/>
-              <w:left w:val="single" w:sz="0" w:space="0" w:color="CCCCCC"/>
-              <w:bottom w:val="single" w:sz="0" w:space="0" w:color="CCCCCC"/>
-              <w:right w:val="single" w:sz="0" w:space="0" w:color="CCCCCC"/>
-            </w:tcBorders>
-            <w:shd w:val="clear" w:color="auto" w:fill="A03030"/>
-            <w:tcMar>
-              <w:top w:w="90" w:type="dxa"/>
-              <w:left w:w="130" w:type="dxa"/>
-              <w:bottom w:w="90" w:type="dxa"/>
-              <w:right w:w="130" w:type="dxa"/>
-            </w:tcMar>
-            <w:vAlign w:val="center"/>
-          </w:tcPr>
-          <w:p>
-            <w:pPr>
-              <w:jc w:val="center"/>
-            </w:pPr>
-            <w:r>
-              <w:rPr>
-                <w:b/>
-                <w:bCs/>
-                <w:color w:val="FFFFFF"/>
-                <w:sz w:val="18"/>
-                <w:szCs w:val="18"/>
-              </w:rPr>
-              <w:t>FINANCES</w:t>
-            </w:r>
-          </w:p>
-        </w:tc>
-        <w:tc>
-          <w:tcPr>
-            <w:tcW w:w="7320" w:type="dxa"/>
-            <w:tcBorders>
-              <w:top w:val="single" w:sz="0" w:space="0" w:color="CCCCCC"/>
-              <w:left w:val="single" w:sz="0" w:space="0" w:color="CCCCCC"/>
-              <w:bottom w:val="single" w:sz="0" w:space="0" w:color="CCCCCC"/>
-              <w:right w:val="single" w:sz="0" w:space="0" w:color="CCCCCC"/>
-            </w:tcBorders>
-            <w:shd w:val="clear" w:color="auto" w:fill="F5F7FA"/>
-            <w:tcMar>
-              <w:top w:w="90" w:type="dxa"/>
-              <w:left w:w="130" w:type="dxa"/>
-              <w:bottom w:w="90" w:type="dxa"/>
-              <w:right w:w="130" w:type="dxa"/>
-            </w:tcMar>
-          </w:tcPr>
-          <w:p>
-            <w:r>
-              <w:rPr>
-                <w:color w:val="1A2638"/>
-                <w:sz w:val="18"/>
-                <w:szCs w:val="18"/>
-              </w:rPr>
-              <w:t>200 000 FCFA/surveillant/semestre · ~4 000 000 FCFA pour 20 surveillants/session · Budget télésurveillance : inconnu à ce stade · Aucune étude de coût initiée · Financement = premier obstacle cité par l'administration</w:t>
-            </w:r>
-          </w:p>
-        </w:tc>
-      </w:tr>
-      <w:tr>
-        <w:tc>
-          <w:tcPr>
-            <w:tcW w:w="2040" w:type="dxa"/>
-            <w:tcBorders>
-              <w:top w:val="single" w:sz="0" w:space="0" w:color="CCCCCC"/>
-              <w:left w:val="single" w:sz="0" w:space="0" w:color="CCCCCC"/>
-              <w:bottom w:val="single" w:sz="0" w:space="0" w:color="CCCCCC"/>
-              <w:right w:val="single" w:sz="0" w:space="0" w:color="CCCCCC"/>
-            </w:tcBorders>
-            <w:shd w:val="clear" w:color="auto" w:fill="5E4A8A"/>
-            <w:tcMar>
-              <w:top w:w="90" w:type="dxa"/>
-              <w:left w:w="130" w:type="dxa"/>
-              <w:bottom w:w="90" w:type="dxa"/>
-              <w:right w:w="130" w:type="dxa"/>
-            </w:tcMar>
-            <w:vAlign w:val="center"/>
-          </w:tcPr>
-          <w:p>
-            <w:pPr>
-              <w:jc w:val="center"/>
-            </w:pPr>
-            <w:r>
-              <w:rPr>
-                <w:b/>
-                <w:bCs/>
-                <w:color w:val="FFFFFF"/>
-                <w:sz w:val="18"/>
-                <w:szCs w:val="18"/>
-              </w:rPr>
-              <w:t xml:space="preserve">ÉTHIQUE &amp; </w:t>
-            </w:r>
-            <w:r>
-              <w:rPr>
-                <w:b/>
-                <w:bCs/>
-                <w:color w:val="FFFFFF"/>
-                <w:sz w:val="18"/>
-                <w:szCs w:val="18"/>
-              </w:rPr>
-              <w:t>CADRE</w:t>
-            </w:r>
-          </w:p>
-        </w:tc>
-        <w:tc>
-          <w:tcPr>
-            <w:tcW w:w="7320" w:type="dxa"/>
-            <w:tcBorders>
-              <w:top w:val="single" w:sz="0" w:space="0" w:color="CCCCCC"/>
-              <w:left w:val="single" w:sz="0" w:space="0" w:color="CCCCCC"/>
-              <w:bottom w:val="single" w:sz="0" w:space="0" w:color="CCCCCC"/>
-              <w:right w:val="single" w:sz="0" w:space="0" w:color="CCCCCC"/>
-            </w:tcBorders>
-            <w:shd w:val="clear" w:color="auto" w:fill="F5F7FA"/>
-            <w:tcMar>
-              <w:top w:w="90" w:type="dxa"/>
-              <w:left w:w="130" w:type="dxa"/>
-              <w:bottom w:w="90" w:type="dxa"/>
-              <w:right w:w="130" w:type="dxa"/>
-            </w:tcMar>
-          </w:tcPr>
-          <w:p>
-            <w:r>
-              <w:rPr>
-                <w:color w:val="1A2638"/>
-                <w:sz w:val="18"/>
-                <w:szCs w:val="18"/>
-              </w:rPr>
-              <w:t>Nécessité d'autorisation du rectorat + directeur d'UFR · Consentement des étudiants et enseignants requis · Conformité réglementation nationale sur la vidéosurveillance · Hébergement et protection des données non traités institutionnellement</w:t>
-            </w:r>
-          </w:p>
-        </w:tc>
-      </w:tr>
-      <w:tr>
-        <w:tc>
-          <w:tcPr>
-            <w:tcW w:w="2040" w:type="dxa"/>
-            <w:tcBorders>
-              <w:top w:val="single" w:sz="0" w:space="0" w:color="CCCCCC"/>
-              <w:left w:val="single" w:sz="0" w:space="0" w:color="CCCCCC"/>
-              <w:bottom w:val="single" w:sz="0" w:space="0" w:color="CCCCCC"/>
-              <w:right w:val="single" w:sz="0" w:space="0" w:color="CCCCCC"/>
-            </w:tcBorders>
-            <w:shd w:val="clear" w:color="auto" w:fill="3A6E4A"/>
-            <w:tcMar>
-              <w:top w:w="90" w:type="dxa"/>
-              <w:left w:w="130" w:type="dxa"/>
-              <w:bottom w:w="90" w:type="dxa"/>
-              <w:right w:w="130" w:type="dxa"/>
-            </w:tcMar>
-            <w:vAlign w:val="center"/>
-          </w:tcPr>
-          <w:p>
-            <w:pPr>
-              <w:jc w:val="center"/>
-            </w:pPr>
-            <w:r>
-              <w:rPr>
-                <w:b/>
-                <w:bCs/>
-                <w:color w:val="FFFFFF"/>
-                <w:sz w:val="18"/>
-                <w:szCs w:val="18"/>
-              </w:rPr>
-              <w:t>ACCEPTABILITÉ</w:t>
-            </w:r>
-          </w:p>
-        </w:tc>
-        <w:tc>
-          <w:tcPr>
-            <w:tcW w:w="7320" w:type="dxa"/>
-            <w:tcBorders>
-              <w:top w:val="single" w:sz="0" w:space="0" w:color="CCCCCC"/>
-              <w:left w:val="single" w:sz="0" w:space="0" w:color="CCCCCC"/>
-              <w:bottom w:val="single" w:sz="0" w:space="0" w:color="CCCCCC"/>
-              <w:right w:val="single" w:sz="0" w:space="0" w:color="CCCCCC"/>
-            </w:tcBorders>
-            <w:shd w:val="clear" w:color="auto" w:fill="F5F7FA"/>
-            <w:tcMar>
-              <w:top w:w="90" w:type="dxa"/>
-              <w:left w:w="130" w:type="dxa"/>
-              <w:bottom w:w="90" w:type="dxa"/>
-              <w:right w:w="130" w:type="dxa"/>
-            </w:tcMar>
-          </w:tcPr>
-          <w:p>
-            <w:r>
-              <w:rPr>
-                <w:color w:val="1A2638"/>
-                <w:sz w:val="18"/>
-                <w:szCs w:val="18"/>
-              </w:rPr>
-              <w:t>3 étudiants sur 4 FAVORABLES · Enseignants : très favorables sous conditions légales · Administration : ouverte mais bloquée par l'absence de budget et de cadre · Surprise : les étudiants veulent les caméras pour surveiller aussi les surveill</w:t>
-            </w:r>
-            <w:r>
-              <w:rPr>
-                <w:color w:val="1A2638"/>
-                <w:sz w:val="18"/>
-                <w:szCs w:val="18"/>
-              </w:rPr>
-              <w:t>ants</w:t>
+              <w:t>3 étudiants sur 4 FAVORABLES · Enseignants : très favorables sous conditions légales · Administration : ouverte mais bloquée par l'absence de budget et de cadre · Surprise : les étudiants veulent les caméras pour surveiller aussi les surveillants</w:t>
             </w:r>
           </w:p>
         </w:tc>
@@ -1209,15 +1143,123 @@
                 <w:sz w:val="17"/>
                 <w:szCs w:val="17"/>
               </w:rPr>
-              <w:t>Surveillance humaine subjective</w:t>
-            </w:r>
+              <w:t>Surveillance humaine subjective, sans preuve documentée</w:t>
+            </w:r>
+          </w:p>
+        </w:tc>
+        <w:tc>
+          <w:tcPr>
+            <w:tcW w:w="2760" w:type="dxa"/>
+            <w:tcBorders>
+              <w:top w:val="single" w:sz="0" w:space="0" w:color="CCCCCC"/>
+              <w:left w:val="single" w:sz="0" w:space="0" w:color="CCCCCC"/>
+              <w:bottom w:val="single" w:sz="0" w:space="0" w:color="CCCCCC"/>
+              <w:right w:val="single" w:sz="0" w:space="0" w:color="CCCCCC"/>
+            </w:tcBorders>
+            <w:shd w:val="clear" w:color="auto" w:fill="F5F7FA"/>
+            <w:tcMar>
+              <w:top w:w="90" w:type="dxa"/>
+              <w:left w:w="130" w:type="dxa"/>
+              <w:bottom w:w="90" w:type="dxa"/>
+              <w:right w:w="130" w:type="dxa"/>
+            </w:tcMar>
+          </w:tcPr>
+          <w:p>
+            <w:r>
+              <w:rPr>
+                <w:color w:val="1A2638"/>
+                <w:sz w:val="17"/>
+                <w:szCs w:val="17"/>
+              </w:rPr>
+              <w:t>10 cas officiels/session vs fraudes réelles — écart non résolu</w:t>
+            </w:r>
+          </w:p>
+        </w:tc>
+      </w:tr>
+      <w:tr>
+        <w:tc>
+          <w:tcPr>
+            <w:tcW w:w="1700" w:type="dxa"/>
+            <w:tcBorders>
+              <w:top w:val="single" w:sz="0" w:space="0" w:color="CCCCCC"/>
+              <w:left w:val="single" w:sz="0" w:space="0" w:color="CCCCCC"/>
+              <w:bottom w:val="single" w:sz="0" w:space="0" w:color="CCCCCC"/>
+              <w:right w:val="single" w:sz="0" w:space="0" w:color="CCCCCC"/>
+            </w:tcBorders>
+            <w:shd w:val="clear" w:color="auto" w:fill="D6E8F7"/>
+            <w:tcMar>
+              <w:top w:w="90" w:type="dxa"/>
+              <w:left w:w="130" w:type="dxa"/>
+              <w:bottom w:w="90" w:type="dxa"/>
+              <w:right w:w="130" w:type="dxa"/>
+            </w:tcMar>
+          </w:tcPr>
+          <w:p>
+            <w:r>
+              <w:rPr>
+                <w:b/>
+                <w:bCs/>
+                <w:color w:val="1B3A6B"/>
+                <w:sz w:val="17"/>
+                <w:szCs w:val="17"/>
+              </w:rPr>
+              <w:t>Service informatique</w:t>
+            </w:r>
+          </w:p>
+        </w:tc>
+        <w:tc>
+          <w:tcPr>
+            <w:tcW w:w="2300" w:type="dxa"/>
+            <w:tcBorders>
+              <w:top w:val="single" w:sz="0" w:space="0" w:color="CCCCCC"/>
+              <w:left w:val="single" w:sz="0" w:space="0" w:color="CCCCCC"/>
+              <w:bottom w:val="single" w:sz="0" w:space="0" w:color="CCCCCC"/>
+              <w:right w:val="single" w:sz="0" w:space="0" w:color="CCCCCC"/>
+            </w:tcBorders>
+            <w:shd w:val="clear" w:color="auto" w:fill="FFFFFF"/>
+            <w:tcMar>
+              <w:top w:w="90" w:type="dxa"/>
+              <w:left w:w="130" w:type="dxa"/>
+              <w:bottom w:w="90" w:type="dxa"/>
+              <w:right w:w="130" w:type="dxa"/>
+            </w:tcMar>
+          </w:tcPr>
+          <w:p>
+            <w:r>
+              <w:rPr>
+                <w:color w:val="1A2638"/>
+                <w:sz w:val="17"/>
+                <w:szCs w:val="17"/>
+              </w:rPr>
+              <w:t>Ne peut activer un système numérique viable</w:t>
+            </w:r>
+          </w:p>
+        </w:tc>
+        <w:tc>
+          <w:tcPr>
+            <w:tcW w:w="2600" w:type="dxa"/>
+            <w:tcBorders>
+              <w:top w:val="single" w:sz="0" w:space="0" w:color="CCCCCC"/>
+              <w:left w:val="single" w:sz="0" w:space="0" w:color="CCCCCC"/>
+              <w:bottom w:val="single" w:sz="0" w:space="0" w:color="CCCCCC"/>
+              <w:right w:val="single" w:sz="0" w:space="0" w:color="CCCCCC"/>
+            </w:tcBorders>
+            <w:shd w:val="clear" w:color="auto" w:fill="FFFFFF"/>
+            <w:tcMar>
+              <w:top w:w="90" w:type="dxa"/>
+              <w:left w:w="130" w:type="dxa"/>
+              <w:bottom w:w="90" w:type="dxa"/>
+              <w:right w:w="130" w:type="dxa"/>
+            </w:tcMar>
+          </w:tcPr>
+          <w:p>
             <w:r>
               <w:rPr>
                 <w:color w:val="4A5568"/>
                 <w:sz w:val="17"/>
                 <w:szCs w:val="17"/>
               </w:rPr>
-              <w:t>, sans preuve documentée</w:t>
+              <w:t>Caméras existantes hors service, infra non dédiée à l'UFR</w:t>
             </w:r>
           </w:p>
         </w:tc>
@@ -1245,7 +1287,7 @@
                 <w:sz w:val="17"/>
                 <w:szCs w:val="17"/>
               </w:rPr>
-              <w:t>10 cas officiels/session vs fraudes réelles — écart non résolu</w:t>
+              <w:t>Dépendance totale aux méthodes manuelles malgré les équipements</w:t>
             </w:r>
           </w:p>
         </w:tc>
@@ -1277,7 +1319,7 @@
                 <w:sz w:val="17"/>
                 <w:szCs w:val="17"/>
               </w:rPr>
-              <w:t>Service informatique</w:t>
+              <w:t>Institution</w:t>
             </w:r>
           </w:p>
         </w:tc>
@@ -1305,7 +1347,7 @@
                 <w:sz w:val="17"/>
                 <w:szCs w:val="17"/>
               </w:rPr>
-              <w:t>Ne peut activer un système numérique viable</w:t>
+              <w:t>Coût de surveillance élevé, efficacité insuffisante</w:t>
             </w:r>
           </w:p>
         </w:tc>
@@ -1333,7 +1375,7 @@
                 <w:sz w:val="17"/>
                 <w:szCs w:val="17"/>
               </w:rPr>
-              <w:t>Caméras existantes hors service, infra non dédiée à l'UFR</w:t>
+              <w:t>4 M FCFA/session pour un dispositif lacunaire</w:t>
             </w:r>
           </w:p>
         </w:tc>
@@ -1361,200 +1403,68 @@
                 <w:sz w:val="17"/>
                 <w:szCs w:val="17"/>
               </w:rPr>
-              <w:t xml:space="preserve">Dépendance totale aux méthodes manuelles </w:t>
-            </w:r>
+              <w:t>Gaspillage budgétaire sans réduction avérée de la fraude</w:t>
+            </w:r>
+          </w:p>
+        </w:tc>
+      </w:tr>
+      <w:tr>
+        <w:tc>
+          <w:tcPr>
+            <w:tcW w:w="1700" w:type="dxa"/>
+            <w:tcBorders>
+              <w:top w:val="single" w:sz="0" w:space="0" w:color="CCCCCC"/>
+              <w:left w:val="single" w:sz="0" w:space="0" w:color="CCCCCC"/>
+              <w:bottom w:val="single" w:sz="0" w:space="0" w:color="CCCCCC"/>
+              <w:right w:val="single" w:sz="0" w:space="0" w:color="CCCCCC"/>
+            </w:tcBorders>
+            <w:shd w:val="clear" w:color="auto" w:fill="D6E8F7"/>
+            <w:tcMar>
+              <w:top w:w="90" w:type="dxa"/>
+              <w:left w:w="130" w:type="dxa"/>
+              <w:bottom w:w="90" w:type="dxa"/>
+              <w:right w:w="130" w:type="dxa"/>
+            </w:tcMar>
+          </w:tcPr>
+          <w:p>
+            <w:r>
+              <w:rPr>
+                <w:b/>
+                <w:bCs/>
+                <w:color w:val="1B3A6B"/>
+                <w:sz w:val="17"/>
+                <w:szCs w:val="17"/>
+              </w:rPr>
+              <w:lastRenderedPageBreak/>
+              <w:t xml:space="preserve">Parties prenantes </w:t>
+            </w:r>
+          </w:p>
+        </w:tc>
+        <w:tc>
+          <w:tcPr>
+            <w:tcW w:w="2300" w:type="dxa"/>
+            <w:tcBorders>
+              <w:top w:val="single" w:sz="0" w:space="0" w:color="CCCCCC"/>
+              <w:left w:val="single" w:sz="0" w:space="0" w:color="CCCCCC"/>
+              <w:bottom w:val="single" w:sz="0" w:space="0" w:color="CCCCCC"/>
+              <w:right w:val="single" w:sz="0" w:space="0" w:color="CCCCCC"/>
+            </w:tcBorders>
+            <w:shd w:val="clear" w:color="auto" w:fill="FFFFFF"/>
+            <w:tcMar>
+              <w:top w:w="90" w:type="dxa"/>
+              <w:left w:w="130" w:type="dxa"/>
+              <w:bottom w:w="90" w:type="dxa"/>
+              <w:right w:w="130" w:type="dxa"/>
+            </w:tcMar>
+          </w:tcPr>
+          <w:p>
             <w:r>
               <w:rPr>
                 <w:color w:val="1A2638"/>
                 <w:sz w:val="17"/>
                 <w:szCs w:val="17"/>
               </w:rPr>
-              <w:t>malgré les équipements</w:t>
-            </w:r>
-          </w:p>
-        </w:tc>
-      </w:tr>
-      <w:tr>
-        <w:tc>
-          <w:tcPr>
-            <w:tcW w:w="1700" w:type="dxa"/>
-            <w:tcBorders>
-              <w:top w:val="single" w:sz="0" w:space="0" w:color="CCCCCC"/>
-              <w:left w:val="single" w:sz="0" w:space="0" w:color="CCCCCC"/>
-              <w:bottom w:val="single" w:sz="0" w:space="0" w:color="CCCCCC"/>
-              <w:right w:val="single" w:sz="0" w:space="0" w:color="CCCCCC"/>
-            </w:tcBorders>
-            <w:shd w:val="clear" w:color="auto" w:fill="D6E8F7"/>
-            <w:tcMar>
-              <w:top w:w="90" w:type="dxa"/>
-              <w:left w:w="130" w:type="dxa"/>
-              <w:bottom w:w="90" w:type="dxa"/>
-              <w:right w:w="130" w:type="dxa"/>
-            </w:tcMar>
-          </w:tcPr>
-          <w:p>
-            <w:r>
-              <w:rPr>
-                <w:b/>
-                <w:bCs/>
-                <w:color w:val="1B3A6B"/>
-                <w:sz w:val="17"/>
-                <w:szCs w:val="17"/>
-              </w:rPr>
-              <w:t>Institution</w:t>
-            </w:r>
-          </w:p>
-        </w:tc>
-        <w:tc>
-          <w:tcPr>
-            <w:tcW w:w="2300" w:type="dxa"/>
-            <w:tcBorders>
-              <w:top w:val="single" w:sz="0" w:space="0" w:color="CCCCCC"/>
-              <w:left w:val="single" w:sz="0" w:space="0" w:color="CCCCCC"/>
-              <w:bottom w:val="single" w:sz="0" w:space="0" w:color="CCCCCC"/>
-              <w:right w:val="single" w:sz="0" w:space="0" w:color="CCCCCC"/>
-            </w:tcBorders>
-            <w:shd w:val="clear" w:color="auto" w:fill="FFFFFF"/>
-            <w:tcMar>
-              <w:top w:w="90" w:type="dxa"/>
-              <w:left w:w="130" w:type="dxa"/>
-              <w:bottom w:w="90" w:type="dxa"/>
-              <w:right w:w="130" w:type="dxa"/>
-            </w:tcMar>
-          </w:tcPr>
-          <w:p>
-            <w:r>
-              <w:rPr>
-                <w:color w:val="1A2638"/>
-                <w:sz w:val="17"/>
-                <w:szCs w:val="17"/>
-              </w:rPr>
-              <w:t>Coût de surveillance élevé, efficacité insuffisante</w:t>
-            </w:r>
-          </w:p>
-        </w:tc>
-        <w:tc>
-          <w:tcPr>
-            <w:tcW w:w="2600" w:type="dxa"/>
-            <w:tcBorders>
-              <w:top w:val="single" w:sz="0" w:space="0" w:color="CCCCCC"/>
-              <w:left w:val="single" w:sz="0" w:space="0" w:color="CCCCCC"/>
-              <w:bottom w:val="single" w:sz="0" w:space="0" w:color="CCCCCC"/>
-              <w:right w:val="single" w:sz="0" w:space="0" w:color="CCCCCC"/>
-            </w:tcBorders>
-            <w:shd w:val="clear" w:color="auto" w:fill="FFFFFF"/>
-            <w:tcMar>
-              <w:top w:w="90" w:type="dxa"/>
-              <w:left w:w="130" w:type="dxa"/>
-              <w:bottom w:w="90" w:type="dxa"/>
-              <w:right w:w="130" w:type="dxa"/>
-            </w:tcMar>
-          </w:tcPr>
-          <w:p>
-            <w:r>
-              <w:rPr>
-                <w:color w:val="4A5568"/>
-                <w:sz w:val="17"/>
-                <w:szCs w:val="17"/>
-              </w:rPr>
-              <w:t>4 M FCFA/session pour un dispositif lacunaire</w:t>
-            </w:r>
-          </w:p>
-        </w:tc>
-        <w:tc>
-          <w:tcPr>
-            <w:tcW w:w="2760" w:type="dxa"/>
-            <w:tcBorders>
-              <w:top w:val="single" w:sz="0" w:space="0" w:color="CCCCCC"/>
-              <w:left w:val="single" w:sz="0" w:space="0" w:color="CCCCCC"/>
-              <w:bottom w:val="single" w:sz="0" w:space="0" w:color="CCCCCC"/>
-              <w:right w:val="single" w:sz="0" w:space="0" w:color="CCCCCC"/>
-            </w:tcBorders>
-            <w:shd w:val="clear" w:color="auto" w:fill="F5F7FA"/>
-            <w:tcMar>
-              <w:top w:w="90" w:type="dxa"/>
-              <w:left w:w="130" w:type="dxa"/>
-              <w:bottom w:w="90" w:type="dxa"/>
-              <w:right w:w="130" w:type="dxa"/>
-            </w:tcMar>
-          </w:tcPr>
-          <w:p>
-            <w:r>
-              <w:rPr>
-                <w:color w:val="1A2638"/>
-                <w:sz w:val="17"/>
-                <w:szCs w:val="17"/>
-              </w:rPr>
-              <w:t>Gaspillage budgétaire sans réduction avérée de la fraude</w:t>
-            </w:r>
-          </w:p>
-        </w:tc>
-      </w:tr>
-      <w:tr>
-        <w:tc>
-          <w:tcPr>
-            <w:tcW w:w="1700" w:type="dxa"/>
-            <w:tcBorders>
-              <w:top w:val="single" w:sz="0" w:space="0" w:color="CCCCCC"/>
-              <w:left w:val="single" w:sz="0" w:space="0" w:color="CCCCCC"/>
-              <w:bottom w:val="single" w:sz="0" w:space="0" w:color="CCCCCC"/>
-              <w:right w:val="single" w:sz="0" w:space="0" w:color="CCCCCC"/>
-            </w:tcBorders>
-            <w:shd w:val="clear" w:color="auto" w:fill="D6E8F7"/>
-            <w:tcMar>
-              <w:top w:w="90" w:type="dxa"/>
-              <w:left w:w="130" w:type="dxa"/>
-              <w:bottom w:w="90" w:type="dxa"/>
-              <w:right w:w="130" w:type="dxa"/>
-            </w:tcMar>
-          </w:tcPr>
-          <w:p>
-            <w:r>
-              <w:rPr>
-                <w:b/>
-                <w:bCs/>
-                <w:color w:val="1B3A6B"/>
-                <w:sz w:val="17"/>
-                <w:szCs w:val="17"/>
-              </w:rPr>
-              <w:lastRenderedPageBreak/>
-              <w:t xml:space="preserve">Parties prenantes </w:t>
-            </w:r>
-          </w:p>
-        </w:tc>
-        <w:tc>
-          <w:tcPr>
-            <w:tcW w:w="2300" w:type="dxa"/>
-            <w:tcBorders>
-              <w:top w:val="single" w:sz="0" w:space="0" w:color="CCCCCC"/>
-              <w:left w:val="single" w:sz="0" w:space="0" w:color="CCCCCC"/>
-              <w:bottom w:val="single" w:sz="0" w:space="0" w:color="CCCCCC"/>
-              <w:right w:val="single" w:sz="0" w:space="0" w:color="CCCCCC"/>
-            </w:tcBorders>
-            <w:shd w:val="clear" w:color="auto" w:fill="FFFFFF"/>
-            <w:tcMar>
-              <w:top w:w="90" w:type="dxa"/>
-              <w:left w:w="130" w:type="dxa"/>
-              <w:bottom w:w="90" w:type="dxa"/>
-              <w:right w:w="130" w:type="dxa"/>
-            </w:tcMar>
-          </w:tcPr>
-          <w:p>
-            <w:r>
-              <w:rPr>
-                <w:color w:val="1A2638"/>
-                <w:sz w:val="17"/>
-                <w:szCs w:val="17"/>
-              </w:rPr>
-              <w:t xml:space="preserve">Risque de blocage institutionnel </w:t>
-            </w:r>
-            <w:r>
-              <w:rPr>
-                <w:color w:val="1A2638"/>
-                <w:sz w:val="17"/>
-                <w:szCs w:val="17"/>
-              </w:rPr>
-              <w:t>du projet</w:t>
+              <w:t>Risque de blocage institutionnel du projet</w:t>
             </w:r>
           </w:p>
         </w:tc>
@@ -1641,13 +1551,7 @@
         <w:rPr>
           <w:color w:val="1A2638"/>
         </w:rPr>
-        <w:t xml:space="preserve">Chaque problème clé est transformé en question d'innovation ouverte. Priorité ★★★ = HMW </w:t>
-      </w:r>
-      <w:r>
-        <w:rPr>
-          <w:color w:val="1A2638"/>
-        </w:rPr>
-        <w:t>prioritaires qui formeront le cœur de la phase Idéation.</w:t>
+        <w:t>Chaque problème clé est transformé en question d'innovation ouverte. Priorité ★★★ = HMW prioritaires qui formeront le cœur de la phase Idéation.</w:t>
       </w:r>
     </w:p>
     <w:p>
@@ -1673,9 +1577,9 @@
         <w:tblLook w:val="04A0" w:firstRow="1" w:lastRow="0" w:firstColumn="1" w:lastColumn="0" w:noHBand="0" w:noVBand="1"/>
       </w:tblPr>
       <w:tblGrid>
-        <w:gridCol w:w="4000"/>
-        <w:gridCol w:w="4360"/>
-        <w:gridCol w:w="1000"/>
+        <w:gridCol w:w="3945"/>
+        <w:gridCol w:w="4304"/>
+        <w:gridCol w:w="1111"/>
       </w:tblGrid>
       <w:tr>
         <w:tc>
@@ -1773,7 +1677,17 @@
                 <w:sz w:val="18"/>
                 <w:szCs w:val="18"/>
               </w:rPr>
-              <w:t>PRIO.</w:t>
+              <w:t>PRIO</w:t>
+            </w:r>
+            <w:r>
+              <w:rPr>
+                <w:b/>
+                <w:bCs/>
+                <w:color w:val="FFFFFF"/>
+                <w:sz w:val="18"/>
+                <w:szCs w:val="18"/>
+              </w:rPr>
+              <w:t>RITE</w:t>
             </w:r>
           </w:p>
         </w:tc>
@@ -1833,8 +1747,90 @@
                 <w:sz w:val="18"/>
                 <w:szCs w:val="18"/>
               </w:rPr>
-              <w:t>Comment pourrions-nous étendre la capacité de surveillance sans multiplier le personnel</w:t>
-            </w:r>
+              <w:t>Comment pourrions-nous étendre la capacité de surveillance sans multiplier le personnel humain ?</w:t>
+            </w:r>
+          </w:p>
+        </w:tc>
+        <w:tc>
+          <w:tcPr>
+            <w:tcW w:w="1000" w:type="dxa"/>
+            <w:tcBorders>
+              <w:top w:val="single" w:sz="0" w:space="0" w:color="CCCCCC"/>
+              <w:left w:val="single" w:sz="0" w:space="0" w:color="CCCCCC"/>
+              <w:bottom w:val="single" w:sz="0" w:space="0" w:color="CCCCCC"/>
+              <w:right w:val="single" w:sz="0" w:space="0" w:color="CCCCCC"/>
+            </w:tcBorders>
+            <w:shd w:val="clear" w:color="auto" w:fill="FFFFFF"/>
+            <w:tcMar>
+              <w:top w:w="90" w:type="dxa"/>
+              <w:left w:w="130" w:type="dxa"/>
+              <w:bottom w:w="90" w:type="dxa"/>
+              <w:right w:w="130" w:type="dxa"/>
+            </w:tcMar>
+            <w:vAlign w:val="center"/>
+          </w:tcPr>
+          <w:p>
+            <w:pPr>
+              <w:jc w:val="center"/>
+            </w:pPr>
+            <w:r>
+              <w:rPr>
+                <w:b/>
+                <w:bCs/>
+                <w:color w:val="1B3A6B"/>
+              </w:rPr>
+              <w:t>3</w:t>
+            </w:r>
+          </w:p>
+        </w:tc>
+      </w:tr>
+      <w:tr>
+        <w:tc>
+          <w:tcPr>
+            <w:tcW w:w="4000" w:type="dxa"/>
+            <w:tcBorders>
+              <w:top w:val="single" w:sz="0" w:space="0" w:color="CCCCCC"/>
+              <w:left w:val="single" w:sz="0" w:space="0" w:color="CCCCCC"/>
+              <w:bottom w:val="single" w:sz="0" w:space="0" w:color="CCCCCC"/>
+              <w:right w:val="single" w:sz="0" w:space="0" w:color="CCCCCC"/>
+            </w:tcBorders>
+            <w:shd w:val="clear" w:color="auto" w:fill="F5F7FA"/>
+            <w:tcMar>
+              <w:top w:w="90" w:type="dxa"/>
+              <w:left w:w="130" w:type="dxa"/>
+              <w:bottom w:w="90" w:type="dxa"/>
+              <w:right w:w="130" w:type="dxa"/>
+            </w:tcMar>
+          </w:tcPr>
+          <w:p>
+            <w:r>
+              <w:rPr>
+                <w:color w:val="1A2638"/>
+                <w:sz w:val="18"/>
+                <w:szCs w:val="18"/>
+              </w:rPr>
+              <w:t>Fraudes réelles non documentées, preuves absentes</w:t>
+            </w:r>
+          </w:p>
+        </w:tc>
+        <w:tc>
+          <w:tcPr>
+            <w:tcW w:w="4360" w:type="dxa"/>
+            <w:tcBorders>
+              <w:top w:val="single" w:sz="0" w:space="0" w:color="CCCCCC"/>
+              <w:left w:val="single" w:sz="0" w:space="0" w:color="CCCCCC"/>
+              <w:bottom w:val="single" w:sz="0" w:space="0" w:color="CCCCCC"/>
+              <w:right w:val="single" w:sz="0" w:space="0" w:color="CCCCCC"/>
+            </w:tcBorders>
+            <w:shd w:val="clear" w:color="auto" w:fill="D6E8F7"/>
+            <w:tcMar>
+              <w:top w:w="90" w:type="dxa"/>
+              <w:left w:w="130" w:type="dxa"/>
+              <w:bottom w:w="90" w:type="dxa"/>
+              <w:right w:w="130" w:type="dxa"/>
+            </w:tcMar>
+          </w:tcPr>
+          <w:p>
             <w:r>
               <w:rPr>
                 <w:b/>
@@ -1843,7 +1839,7 @@
                 <w:sz w:val="18"/>
                 <w:szCs w:val="18"/>
               </w:rPr>
-              <w:t xml:space="preserve"> humain ?</w:t>
+              <w:t>Comment pourrions-nous objectiver et documenter le déroulement des examens pour rendre les sanctions possibles ?</w:t>
             </w:r>
           </w:p>
         </w:tc>
@@ -1875,7 +1871,7 @@
                 <w:bCs/>
                 <w:color w:val="1B3A6B"/>
               </w:rPr>
-              <w:t>★★★</w:t>
+              <w:t>3</w:t>
             </w:r>
           </w:p>
         </w:tc>
@@ -1905,7 +1901,23 @@
                 <w:sz w:val="18"/>
                 <w:szCs w:val="18"/>
               </w:rPr>
-              <w:t>Fraudes réelles non documentées, preuves absentes</w:t>
+              <w:t>Caméras existantes hors service, infra</w:t>
+            </w:r>
+            <w:r>
+              <w:rPr>
+                <w:color w:val="1A2638"/>
+                <w:sz w:val="18"/>
+                <w:szCs w:val="18"/>
+              </w:rPr>
+              <w:t>,</w:t>
+            </w:r>
+            <w:r>
+              <w:rPr>
+                <w:color w:val="1A2638"/>
+                <w:sz w:val="18"/>
+                <w:szCs w:val="18"/>
+              </w:rPr>
+              <w:t xml:space="preserve"> partagée limitée</w:t>
             </w:r>
           </w:p>
         </w:tc>
@@ -1935,7 +1947,7 @@
                 <w:sz w:val="18"/>
                 <w:szCs w:val="18"/>
               </w:rPr>
-              <w:t>Comment pourrions-nous objectiver et documenter le déroulement des examens pour rendre les sanctions possibles ?</w:t>
+              <w:t>Comment concevoir un système de surveillance fonctionnel même avec une connectivité partielle ou un équipement réhabilité ?</w:t>
             </w:r>
           </w:p>
         </w:tc>
@@ -1967,7 +1979,7 @@
                 <w:bCs/>
                 <w:color w:val="1B3A6B"/>
               </w:rPr>
-              <w:t>★★★</w:t>
+              <w:t>3</w:t>
             </w:r>
           </w:p>
         </w:tc>
@@ -1997,7 +2009,7 @@
                 <w:sz w:val="18"/>
                 <w:szCs w:val="18"/>
               </w:rPr>
-              <w:t>Caméras existantes hors service, infra partagée limitée</w:t>
+              <w:t>4 M FCFA/session pour un dispositif insuffisant</w:t>
             </w:r>
           </w:p>
         </w:tc>
@@ -2027,8 +2039,90 @@
                 <w:sz w:val="18"/>
                 <w:szCs w:val="18"/>
               </w:rPr>
-              <w:t>Comment concevoir</w:t>
-            </w:r>
+              <w:t>Comment réduire le coût de la surveillance tout en améliorant son efficacité et son objectivité ?</w:t>
+            </w:r>
+          </w:p>
+        </w:tc>
+        <w:tc>
+          <w:tcPr>
+            <w:tcW w:w="1000" w:type="dxa"/>
+            <w:tcBorders>
+              <w:top w:val="single" w:sz="0" w:space="0" w:color="CCCCCC"/>
+              <w:left w:val="single" w:sz="0" w:space="0" w:color="CCCCCC"/>
+              <w:bottom w:val="single" w:sz="0" w:space="0" w:color="CCCCCC"/>
+              <w:right w:val="single" w:sz="0" w:space="0" w:color="CCCCCC"/>
+            </w:tcBorders>
+            <w:shd w:val="clear" w:color="auto" w:fill="FFFFFF"/>
+            <w:tcMar>
+              <w:top w:w="90" w:type="dxa"/>
+              <w:left w:w="130" w:type="dxa"/>
+              <w:bottom w:w="90" w:type="dxa"/>
+              <w:right w:w="130" w:type="dxa"/>
+            </w:tcMar>
+            <w:vAlign w:val="center"/>
+          </w:tcPr>
+          <w:p>
+            <w:pPr>
+              <w:jc w:val="center"/>
+            </w:pPr>
+            <w:r>
+              <w:rPr>
+                <w:b/>
+                <w:bCs/>
+                <w:color w:val="2E6DA4"/>
+              </w:rPr>
+              <w:t>2</w:t>
+            </w:r>
+          </w:p>
+        </w:tc>
+      </w:tr>
+      <w:tr>
+        <w:tc>
+          <w:tcPr>
+            <w:tcW w:w="4000" w:type="dxa"/>
+            <w:tcBorders>
+              <w:top w:val="single" w:sz="0" w:space="0" w:color="CCCCCC"/>
+              <w:left w:val="single" w:sz="0" w:space="0" w:color="CCCCCC"/>
+              <w:bottom w:val="single" w:sz="0" w:space="0" w:color="CCCCCC"/>
+              <w:right w:val="single" w:sz="0" w:space="0" w:color="CCCCCC"/>
+            </w:tcBorders>
+            <w:shd w:val="clear" w:color="auto" w:fill="F5F7FA"/>
+            <w:tcMar>
+              <w:top w:w="90" w:type="dxa"/>
+              <w:left w:w="130" w:type="dxa"/>
+              <w:bottom w:w="90" w:type="dxa"/>
+              <w:right w:w="130" w:type="dxa"/>
+            </w:tcMar>
+          </w:tcPr>
+          <w:p>
+            <w:r>
+              <w:rPr>
+                <w:color w:val="1A2638"/>
+                <w:sz w:val="18"/>
+                <w:szCs w:val="18"/>
+              </w:rPr>
+              <w:t>Craintes réglementaires et éthiques légitimes</w:t>
+            </w:r>
+          </w:p>
+        </w:tc>
+        <w:tc>
+          <w:tcPr>
+            <w:tcW w:w="4360" w:type="dxa"/>
+            <w:tcBorders>
+              <w:top w:val="single" w:sz="0" w:space="0" w:color="CCCCCC"/>
+              <w:left w:val="single" w:sz="0" w:space="0" w:color="CCCCCC"/>
+              <w:bottom w:val="single" w:sz="0" w:space="0" w:color="CCCCCC"/>
+              <w:right w:val="single" w:sz="0" w:space="0" w:color="CCCCCC"/>
+            </w:tcBorders>
+            <w:shd w:val="clear" w:color="auto" w:fill="D6E8F7"/>
+            <w:tcMar>
+              <w:top w:w="90" w:type="dxa"/>
+              <w:left w:w="130" w:type="dxa"/>
+              <w:bottom w:w="90" w:type="dxa"/>
+              <w:right w:w="130" w:type="dxa"/>
+            </w:tcMar>
+          </w:tcPr>
+          <w:p>
             <w:r>
               <w:rPr>
                 <w:b/>
@@ -2037,7 +2131,7 @@
                 <w:sz w:val="18"/>
                 <w:szCs w:val="18"/>
               </w:rPr>
-              <w:t xml:space="preserve"> un système de surveillance fonctionnel même avec une connectivité partielle ou un équipement réhabilité ?</w:t>
+              <w:t>Comment garantir un dispositif respectueux de la vie privée, conforme à la loi et consensuel institutionnellement ?</w:t>
             </w:r>
           </w:p>
         </w:tc>
@@ -2067,9 +2161,9 @@
               <w:rPr>
                 <w:b/>
                 <w:bCs/>
-                <w:color w:val="1B3A6B"/>
-              </w:rPr>
-              <w:t>★★★</w:t>
+                <w:color w:val="2E6DA4"/>
+              </w:rPr>
+              <w:t>2</w:t>
             </w:r>
           </w:p>
         </w:tc>
@@ -2099,8 +2193,10 @@
                 <w:sz w:val="18"/>
                 <w:szCs w:val="18"/>
               </w:rPr>
-              <w:t>4 M FCFA/session pour un dispositif insuffisant</w:t>
-            </w:r>
+              <w:t>Paradoxe : infrastructure disponible mais inexploitée</w:t>
+            </w:r>
+            <w:bookmarkStart w:id="0" w:name="_GoBack"/>
+            <w:bookmarkEnd w:id="0"/>
           </w:p>
         </w:tc>
         <w:tc>
@@ -2129,17 +2225,7 @@
                 <w:sz w:val="18"/>
                 <w:szCs w:val="18"/>
               </w:rPr>
-              <w:t xml:space="preserve">Comment réduire le coût de la surveillance tout en améliorant son efficacité et son objectivité </w:t>
-            </w:r>
-            <w:r>
-              <w:rPr>
-                <w:b/>
-                <w:bCs/>
-                <w:color w:val="1B3A6B"/>
-                <w:sz w:val="18"/>
-                <w:szCs w:val="18"/>
-              </w:rPr>
-              <w:t>?</w:t>
+              <w:t>Comment mobiliser les ressources techniques et humaines déjà présente à l'UFR SATIC pour éviter un investissement from scratch ?</w:t>
             </w:r>
           </w:p>
         </w:tc>
@@ -2171,211 +2257,7 @@
                 <w:bCs/>
                 <w:color w:val="2E6DA4"/>
               </w:rPr>
-              <w:t>★★</w:t>
-            </w:r>
-          </w:p>
-        </w:tc>
-      </w:tr>
-      <w:tr>
-        <w:tc>
-          <w:tcPr>
-            <w:tcW w:w="4000" w:type="dxa"/>
-            <w:tcBorders>
-              <w:top w:val="single" w:sz="0" w:space="0" w:color="CCCCCC"/>
-              <w:left w:val="single" w:sz="0" w:space="0" w:color="CCCCCC"/>
-              <w:bottom w:val="single" w:sz="0" w:space="0" w:color="CCCCCC"/>
-              <w:right w:val="single" w:sz="0" w:space="0" w:color="CCCCCC"/>
-            </w:tcBorders>
-            <w:shd w:val="clear" w:color="auto" w:fill="F5F7FA"/>
-            <w:tcMar>
-              <w:top w:w="90" w:type="dxa"/>
-              <w:left w:w="130" w:type="dxa"/>
-              <w:bottom w:w="90" w:type="dxa"/>
-              <w:right w:w="130" w:type="dxa"/>
-            </w:tcMar>
-          </w:tcPr>
-          <w:p>
-            <w:r>
-              <w:rPr>
-                <w:color w:val="1A2638"/>
-                <w:sz w:val="18"/>
-                <w:szCs w:val="18"/>
-              </w:rPr>
-              <w:t>Craintes réglementaires et éthiques légitimes</w:t>
-            </w:r>
-          </w:p>
-        </w:tc>
-        <w:tc>
-          <w:tcPr>
-            <w:tcW w:w="4360" w:type="dxa"/>
-            <w:tcBorders>
-              <w:top w:val="single" w:sz="0" w:space="0" w:color="CCCCCC"/>
-              <w:left w:val="single" w:sz="0" w:space="0" w:color="CCCCCC"/>
-              <w:bottom w:val="single" w:sz="0" w:space="0" w:color="CCCCCC"/>
-              <w:right w:val="single" w:sz="0" w:space="0" w:color="CCCCCC"/>
-            </w:tcBorders>
-            <w:shd w:val="clear" w:color="auto" w:fill="D6E8F7"/>
-            <w:tcMar>
-              <w:top w:w="90" w:type="dxa"/>
-              <w:left w:w="130" w:type="dxa"/>
-              <w:bottom w:w="90" w:type="dxa"/>
-              <w:right w:w="130" w:type="dxa"/>
-            </w:tcMar>
-          </w:tcPr>
-          <w:p>
-            <w:r>
-              <w:rPr>
-                <w:b/>
-                <w:bCs/>
-                <w:color w:val="1B3A6B"/>
-                <w:sz w:val="18"/>
-                <w:szCs w:val="18"/>
-              </w:rPr>
-              <w:t>Comment garantir un dispositif respectueux de la vie privée, conforme à la loi et consensuel institutionnellement ?</w:t>
-            </w:r>
-          </w:p>
-        </w:tc>
-        <w:tc>
-          <w:tcPr>
-            <w:tcW w:w="1000" w:type="dxa"/>
-            <w:tcBorders>
-              <w:top w:val="single" w:sz="0" w:space="0" w:color="CCCCCC"/>
-              <w:left w:val="single" w:sz="0" w:space="0" w:color="CCCCCC"/>
-              <w:bottom w:val="single" w:sz="0" w:space="0" w:color="CCCCCC"/>
-              <w:right w:val="single" w:sz="0" w:space="0" w:color="CCCCCC"/>
-            </w:tcBorders>
-            <w:shd w:val="clear" w:color="auto" w:fill="FFFFFF"/>
-            <w:tcMar>
-              <w:top w:w="90" w:type="dxa"/>
-              <w:left w:w="130" w:type="dxa"/>
-              <w:bottom w:w="90" w:type="dxa"/>
-              <w:right w:w="130" w:type="dxa"/>
-            </w:tcMar>
-            <w:vAlign w:val="center"/>
-          </w:tcPr>
-          <w:p>
-            <w:pPr>
-              <w:jc w:val="center"/>
-            </w:pPr>
-            <w:r>
-              <w:rPr>
-                <w:b/>
-                <w:bCs/>
-                <w:color w:val="2E6DA4"/>
-              </w:rPr>
-              <w:t>★★</w:t>
-            </w:r>
-          </w:p>
-        </w:tc>
-      </w:tr>
-      <w:tr>
-        <w:tc>
-          <w:tcPr>
-            <w:tcW w:w="4000" w:type="dxa"/>
-            <w:tcBorders>
-              <w:top w:val="single" w:sz="0" w:space="0" w:color="CCCCCC"/>
-              <w:left w:val="single" w:sz="0" w:space="0" w:color="CCCCCC"/>
-              <w:bottom w:val="single" w:sz="0" w:space="0" w:color="CCCCCC"/>
-              <w:right w:val="single" w:sz="0" w:space="0" w:color="CCCCCC"/>
-            </w:tcBorders>
-            <w:shd w:val="clear" w:color="auto" w:fill="F5F7FA"/>
-            <w:tcMar>
-              <w:top w:w="90" w:type="dxa"/>
-              <w:left w:w="130" w:type="dxa"/>
-              <w:bottom w:w="90" w:type="dxa"/>
-              <w:right w:w="130" w:type="dxa"/>
-            </w:tcMar>
-          </w:tcPr>
-          <w:p>
-            <w:r>
-              <w:rPr>
-                <w:color w:val="1A2638"/>
-                <w:sz w:val="18"/>
-                <w:szCs w:val="18"/>
-              </w:rPr>
-              <w:t>Paradoxe : infrastructure disponible mais inexploitée</w:t>
-            </w:r>
-          </w:p>
-        </w:tc>
-        <w:tc>
-          <w:tcPr>
-            <w:tcW w:w="4360" w:type="dxa"/>
-            <w:tcBorders>
-              <w:top w:val="single" w:sz="0" w:space="0" w:color="CCCCCC"/>
-              <w:left w:val="single" w:sz="0" w:space="0" w:color="CCCCCC"/>
-              <w:bottom w:val="single" w:sz="0" w:space="0" w:color="CCCCCC"/>
-              <w:right w:val="single" w:sz="0" w:space="0" w:color="CCCCCC"/>
-            </w:tcBorders>
-            <w:shd w:val="clear" w:color="auto" w:fill="D6E8F7"/>
-            <w:tcMar>
-              <w:top w:w="90" w:type="dxa"/>
-              <w:left w:w="130" w:type="dxa"/>
-              <w:bottom w:w="90" w:type="dxa"/>
-              <w:right w:w="130" w:type="dxa"/>
-            </w:tcMar>
-          </w:tcPr>
-          <w:p>
-            <w:r>
-              <w:rPr>
-                <w:b/>
-                <w:bCs/>
-                <w:color w:val="1B3A6B"/>
-                <w:sz w:val="18"/>
-                <w:szCs w:val="18"/>
-              </w:rPr>
-              <w:t xml:space="preserve">Comment mobiliser les </w:t>
-            </w:r>
-            <w:r>
-              <w:rPr>
-                <w:b/>
-                <w:bCs/>
-                <w:color w:val="1B3A6B"/>
-                <w:sz w:val="18"/>
-                <w:szCs w:val="18"/>
-              </w:rPr>
-              <w:t>ressources techniques et humaines déjà présente</w:t>
-            </w:r>
-            <w:r>
-              <w:rPr>
-                <w:b/>
-                <w:bCs/>
-                <w:color w:val="1B3A6B"/>
-                <w:sz w:val="18"/>
-                <w:szCs w:val="18"/>
-              </w:rPr>
-              <w:t xml:space="preserve"> à l'UFR SATIC pour éviter un investissement from scratch ?</w:t>
-            </w:r>
-          </w:p>
-        </w:tc>
-        <w:tc>
-          <w:tcPr>
-            <w:tcW w:w="1000" w:type="dxa"/>
-            <w:tcBorders>
-              <w:top w:val="single" w:sz="0" w:space="0" w:color="CCCCCC"/>
-              <w:left w:val="single" w:sz="0" w:space="0" w:color="CCCCCC"/>
-              <w:bottom w:val="single" w:sz="0" w:space="0" w:color="CCCCCC"/>
-              <w:right w:val="single" w:sz="0" w:space="0" w:color="CCCCCC"/>
-            </w:tcBorders>
-            <w:shd w:val="clear" w:color="auto" w:fill="FFFFFF"/>
-            <w:tcMar>
-              <w:top w:w="90" w:type="dxa"/>
-              <w:left w:w="130" w:type="dxa"/>
-              <w:bottom w:w="90" w:type="dxa"/>
-              <w:right w:w="130" w:type="dxa"/>
-            </w:tcMar>
-            <w:vAlign w:val="center"/>
-          </w:tcPr>
-          <w:p>
-            <w:pPr>
-              <w:jc w:val="center"/>
-            </w:pPr>
-            <w:r>
-              <w:rPr>
-                <w:b/>
-                <w:bCs/>
-                <w:color w:val="2E6DA4"/>
-              </w:rPr>
-              <w:t>★★</w:t>
+              <w:t>2</w:t>
             </w:r>
           </w:p>
         </w:tc>
@@ -2412,13 +2294,7 @@
         <w:rPr>
           <w:color w:val="1A2638"/>
         </w:rPr>
-        <w:t>Notation sur 5 par critère. Score total /20. Critères : Impact (acte</w:t>
-      </w:r>
-      <w:r>
-        <w:rPr>
-          <w:color w:val="1A2638"/>
-        </w:rPr>
-        <w:t>urs concernés, gravité), Faisabilité technique, Acceptabilité sociale, Contrainte budgétaire.</w:t>
+        <w:t>Notation sur 5 par critère. Score total /20. Critères : Impact (acteurs concernés, gravité), Faisabilité technique, Acceptabilité sociale, Contrainte budgétaire.</w:t>
       </w:r>
     </w:p>
     <w:p>
@@ -2938,15 +2814,7 @@
                 <w:sz w:val="17"/>
                 <w:szCs w:val="17"/>
               </w:rPr>
-              <w:t xml:space="preserve">Documenter objectivement </w:t>
-            </w:r>
-            <w:r>
-              <w:rPr>
-                <w:color w:val="1A2638"/>
-                <w:sz w:val="17"/>
-                <w:szCs w:val="17"/>
-              </w:rPr>
-              <w:t>les examens</w:t>
+              <w:t>Documenter objectivement les examens</w:t>
             </w:r>
           </w:p>
         </w:tc>
@@ -3858,15 +3726,7 @@
                 <w:sz w:val="17"/>
                 <w:szCs w:val="17"/>
               </w:rPr>
-              <w:t xml:space="preserve">Mobiliser </w:t>
-            </w:r>
-            <w:r>
-              <w:rPr>
-                <w:color w:val="1A2638"/>
-                <w:sz w:val="17"/>
-                <w:szCs w:val="17"/>
-              </w:rPr>
-              <w:t>ressources internes existantes</w:t>
+              <w:t>Mobiliser ressources internes existantes</w:t>
             </w:r>
           </w:p>
         </w:tc>
@@ -4163,33 +4023,38 @@
                 <w:sz w:val="21"/>
                 <w:szCs w:val="21"/>
               </w:rPr>
-              <w:t xml:space="preserve">Les acteurs du processus d'évaluation de l'UFR SATIC — étudiants, enseignants et administration — ont besoin d'un système de </w:t>
+              <w:t>Les acteurs du processus d'évaluation de l'UFR SATIC — étudiants, enseignants et administration — ont besoin d'un système de surveillance des examens fiable, objectif et conforme à la réglementation, parce que le dispositif actuel, exclusivement humain, ne peut couvrir des amphis de 300 à 500 étudiants avec seulement 5 à 6 surveillants, ne produit aucune preuve documentée des fraudes (estimées à une dizaine de cas officiels par session mais réellement sous-comptées), mobilise un budget de ~4 000 000 FCFA/session sans résultat proportionnel, et repose sur une infrastructure de caméras déjà en place mais non fonctionnelle, dont la réhabilitation</w:t>
             </w:r>
             <w:r>
               <w:rPr>
                 <w:sz w:val="21"/>
                 <w:szCs w:val="21"/>
               </w:rPr>
-              <w:t>surveillance des examens fiable, objectif et conforme à la réglementation, parce que le dispositif actuel, exclusivement humain, ne peut couvrir des amphis de 300 à 500 étudiants avec seulement 5 à 6 surveillants, ne produit aucune preuve documentée des fr</w:t>
+              <w:t xml:space="preserve"> ou le remplacement</w:t>
             </w:r>
             <w:r>
               <w:rPr>
                 <w:sz w:val="21"/>
                 <w:szCs w:val="21"/>
               </w:rPr>
-              <w:t xml:space="preserve">audes (estimées à une dizaine de cas officiels par session mais réellement sous-comptées), mobilise un budget de ~4 000 000 FCFA/session sans résultat proportionnel, et repose sur une infrastructure de caméras déjà en place mais non fonctionnelle, dont la </w:t>
+              <w:t xml:space="preserve"> représente</w:t>
             </w:r>
             <w:r>
               <w:rPr>
                 <w:sz w:val="21"/>
                 <w:szCs w:val="21"/>
               </w:rPr>
-              <w:t>réhabilitation représente la voie la plus réaliste vers la modernisation.</w:t>
-            </w:r>
-          </w:p>
-        </w:tc>
-        <w:bookmarkStart w:id="0" w:name="_GoBack"/>
-        <w:bookmarkEnd w:id="0"/>
+              <w:t>nt</w:t>
+            </w:r>
+            <w:r>
+              <w:rPr>
+                <w:sz w:val="21"/>
+                <w:szCs w:val="21"/>
+              </w:rPr>
+              <w:t xml:space="preserve"> la voie la plus réaliste vers la modernisation.</w:t>
+            </w:r>
+          </w:p>
+        </w:tc>
       </w:tr>
     </w:tbl>
     <w:p>
@@ -4223,13 +4088,7 @@
         <w:rPr>
           <w:color w:val="1A2638"/>
         </w:rPr>
-        <w:t>Quatre axes directement issus des HMW prioritaires et des surprises/contradictions identifiées dans la synthèse des insights de la Phase Understan</w:t>
-      </w:r>
-      <w:r>
-        <w:rPr>
-          <w:color w:val="1A2638"/>
-        </w:rPr>
-        <w:t>ding.</w:t>
+        <w:t>Quatre axes directement issus des HMW prioritaires et des surprises/contradictions identifiées dans la synthèse des insights de la Phase Understanding.</w:t>
       </w:r>
     </w:p>
     <w:p>
@@ -4330,15 +4189,7 @@
                 <w:sz w:val="18"/>
                 <w:szCs w:val="18"/>
               </w:rPr>
-              <w:t xml:space="preserve">Réhabiliter ou remplacer les caméras existantes non fonctionnelles · Enregistrement local sans dépendance au Wi-Fi · Consultation a posteriori par l'administration · Compatible infra </w:t>
-            </w:r>
-            <w:r>
-              <w:rPr>
-                <w:color w:val="1A2638"/>
-                <w:sz w:val="18"/>
-                <w:szCs w:val="18"/>
-              </w:rPr>
-              <w:t>mutualisée SONATEL/SENUM</w:t>
+              <w:t>Réhabiliter ou remplacer les caméras existantes non fonctionnelles · Enregistrement local sans dépendance au Wi-Fi · Consultation a posteriori par l'administration · Compatible infra mutualisée SONATEL/SENUM</w:t>
             </w:r>
           </w:p>
         </w:tc>
@@ -4415,15 +4266,7 @@
                 <w:sz w:val="18"/>
                 <w:szCs w:val="18"/>
               </w:rPr>
-              <w:t xml:space="preserve">Réduire le ratio de surveillants humains grâce à l'appui technologique · Économies sur les ~4 M FCFA actuels · Protocoles renforcés appuyés sur la preuve objective · Réponse </w:t>
-            </w:r>
-            <w:r>
-              <w:rPr>
-                <w:color w:val="1A2638"/>
-                <w:sz w:val="18"/>
-                <w:szCs w:val="18"/>
-              </w:rPr>
-              <w:t>directe aux insights de Fatou T. (scolarité)</w:t>
+              <w:t>Réduire le ratio de surveillants humains grâce à l'appui technologique · Économies sur les ~4 M FCFA actuels · Protocoles renforcés appuyés sur la preuve objective · Réponse directe aux insights de Fatou T. (scolarité)</w:t>
             </w:r>
           </w:p>
         </w:tc>
@@ -4500,15 +4343,7 @@
                 <w:sz w:val="18"/>
                 <w:szCs w:val="18"/>
               </w:rPr>
-              <w:t xml:space="preserve">Système fonctionnel même en cas de coupure réseau · Stockage local + synchronisation différée · Exploite la capacité de maintenance interne (préventive + </w:t>
-            </w:r>
-            <w:r>
-              <w:rPr>
-                <w:color w:val="1A2638"/>
-                <w:sz w:val="18"/>
-                <w:szCs w:val="18"/>
-              </w:rPr>
-              <w:t>curative) déjà disponible au service informatique</w:t>
+              <w:t>Système fonctionnel même en cas de coupure réseau · Stockage local + synchronisation différée · Exploite la capacité de maintenance interne (préventive + curative) déjà disponible au service informatique</w:t>
             </w:r>
           </w:p>
         </w:tc>
@@ -4585,15 +4420,7 @@
                 <w:sz w:val="18"/>
                 <w:szCs w:val="18"/>
               </w:rPr>
-              <w:t xml:space="preserve">Charte interne de vidéosurveillance · Consentement formalisé des étudiants et enseignants · Validation rectorat + directeur UFR · Réponse aux craintes </w:t>
-            </w:r>
-            <w:r>
-              <w:rPr>
-                <w:color w:val="1A2638"/>
-                <w:sz w:val="18"/>
-                <w:szCs w:val="18"/>
-              </w:rPr>
-              <w:t>légitimes identifiées dans les cartes d'empathie</w:t>
+              <w:t>Charte interne de vidéosurveillance · Consentement formalisé des étudiants et enseignants · Validation rectorat + directeur UFR · Réponse aux craintes légitimes identifiées dans les cartes d'empathie</w:t>
             </w:r>
           </w:p>
         </w:tc>
@@ -4606,7 +4433,7 @@
     </w:p>
     <w:tbl>
       <w:tblPr>
-        <w:tblW w:w="9360" w:type="dxa"/>
+        <w:tblW w:w="9779" w:type="dxa"/>
         <w:tblBorders>
           <w:top w:val="single" w:sz="4" w:space="0" w:color="auto"/>
           <w:left w:val="single" w:sz="4" w:space="0" w:color="auto"/>
@@ -4622,12 +4449,15 @@
         <w:tblLook w:val="04A0" w:firstRow="1" w:lastRow="0" w:firstColumn="1" w:lastColumn="0" w:noHBand="0" w:noVBand="1"/>
       </w:tblPr>
       <w:tblGrid>
-        <w:gridCol w:w="9360"/>
+        <w:gridCol w:w="9779"/>
       </w:tblGrid>
       <w:tr>
-        <w:tc>
-          <w:tcPr>
-            <w:tcW w:w="9360" w:type="dxa"/>
+        <w:trPr>
+          <w:trHeight w:val="3935"/>
+        </w:trPr>
+        <w:tc>
+          <w:tcPr>
+            <w:tcW w:w="9779" w:type="dxa"/>
             <w:tcBorders>
               <w:top w:val="single" w:sz="4" w:space="0" w:color="4A90D9"/>
               <w:left w:val="nil"/>
@@ -4646,12 +4476,17 @@
             <w:pPr>
               <w:spacing w:after="40"/>
               <w:jc w:val="center"/>
+              <w:rPr>
+                <w:b/>
+                <w:sz w:val="32"/>
+              </w:rPr>
             </w:pPr>
             <w:r>
               <w:rPr>
                 <w:b/>
                 <w:bCs/>
                 <w:color w:val="1B3A6B"/>
+                <w:sz w:val="32"/>
               </w:rPr>
               <w:t>→ PROCHAINE ÉTAPE : PHASE 3 — IDÉATION</w:t>
             </w:r>
@@ -4662,11 +4497,30 @@
             </w:pPr>
             <w:r>
               <w:rPr>
+                <w:b/>
                 <w:color w:val="4A5568"/>
-                <w:sz w:val="17"/>
-                <w:szCs w:val="17"/>
-              </w:rPr>
-              <w:t>Générer des solutions créatives sur les 3 HMW prioritaires · Axe central : réhabilitation de l'infra existante + stockage local</w:t>
+                <w:sz w:val="24"/>
+                <w:szCs w:val="17"/>
+              </w:rPr>
+              <w:t>Générer des solutions créatives sur les 3 HMW prioritaires · Axe central :</w:t>
+            </w:r>
+            <w:r>
+              <w:rPr>
+                <w:b/>
+                <w:color w:val="4A5568"/>
+                <w:sz w:val="24"/>
+                <w:szCs w:val="17"/>
+              </w:rPr>
+              <w:t>proposer une nouvelle infra open source et intégrables à une solution web (Web RTC avec protocole UDP)</w:t>
+            </w:r>
+            <w:r>
+              <w:rPr>
+                <w:b/>
+                <w:color w:val="4A5568"/>
+                <w:sz w:val="24"/>
+                <w:szCs w:val="17"/>
+              </w:rPr>
+              <w:t xml:space="preserve"> + stockage local</w:t>
             </w:r>
           </w:p>
         </w:tc>
@@ -4684,7 +4538,7 @@
 </file>
 
 <file path=word/styles.xml><?xml version="1.0" encoding="utf-8"?>
-<w:styles xmlns:mc="http://schemas.openxmlformats.org/markup-compatibility/2006" xmlns:r="http://schemas.openxmlformats.org/officeDocument/2006/relationships" xmlns:w="http://schemas.openxmlformats.org/wordprocessingml/2006/main" xmlns:w14="http://schemas.microsoft.com/office/word/2010/wordml" xmlns:w15="http://schemas.microsoft.com/office/word/2012/wordml" xmlns:w16cid="http://schemas.microsoft.com/office/word/2016/wordml/cid" xmlns:w16se="http://schemas.microsoft.com/office/word/2015/wordml/symex" mc:Ignorable="w14 w15 w16se w16cid">
+<w:styles xmlns:mc="http://schemas.openxmlformats.org/markup-compatibility/2006" xmlns:r="http://schemas.openxmlformats.org/officeDocument/2006/relationships" xmlns:w="http://schemas.openxmlformats.org/wordprocessingml/2006/main" xmlns:w14="http://schemas.microsoft.com/office/word/2010/wordml" xmlns:w15="http://schemas.microsoft.com/office/word/2012/wordml" xmlns:w16se="http://schemas.microsoft.com/office/word/2015/wordml/symex" mc:Ignorable="w14 w15 w16se">
   <w:docDefaults>
     <w:rPrDefault>
       <w:rPr>
@@ -4694,7 +4548,7 @@
     </w:rPrDefault>
     <w:pPrDefault/>
   </w:docDefaults>
-  <w:latentStyles w:defLockedState="0" w:defUIPriority="99" w:defSemiHidden="0" w:defUnhideWhenUsed="0" w:defQFormat="0" w:count="375">
+  <w:latentStyles w:defLockedState="0" w:defUIPriority="99" w:defSemiHidden="0" w:defUnhideWhenUsed="0" w:defQFormat="0" w:count="371">
     <w:lsdException w:name="Normal" w:uiPriority="0" w:qFormat="1"/>
     <w:lsdException w:name="heading 1" w:uiPriority="0" w:qFormat="1"/>
     <w:lsdException w:name="heading 2" w:uiPriority="0" w:qFormat="1"/>
@@ -5062,10 +4916,6 @@
     <w:lsdException w:name="List Table 5 Dark Accent 6" w:uiPriority="50"/>
     <w:lsdException w:name="List Table 6 Colorful Accent 6" w:uiPriority="51"/>
     <w:lsdException w:name="List Table 7 Colorful Accent 6" w:uiPriority="52"/>
-    <w:lsdException w:name="Mention" w:semiHidden="1" w:unhideWhenUsed="1"/>
-    <w:lsdException w:name="Smart Hyperlink" w:semiHidden="1" w:unhideWhenUsed="1"/>
-    <w:lsdException w:name="Hashtag" w:semiHidden="1" w:unhideWhenUsed="1"/>
-    <w:lsdException w:name="Unresolved Mention" w:semiHidden="1" w:unhideWhenUsed="1"/>
   </w:latentStyles>
   <w:style w:type="paragraph" w:default="1" w:styleId="Normal">
     <w:name w:val="Normal"/>
@@ -5550,7 +5400,7 @@
 </file>
 
 <file path=customXml/itemProps1.xml><?xml version="1.0" encoding="utf-8"?>
-<ds:datastoreItem xmlns:ds="http://schemas.openxmlformats.org/officeDocument/2006/customXml" ds:itemID="{D5BAD121-5FA3-4061-B99A-BA6B5A1B22BC}">
+<ds:datastoreItem xmlns:ds="http://schemas.openxmlformats.org/officeDocument/2006/customXml" ds:itemID="{146EAE28-3C52-4565-A48C-C8096752B3D8}">
   <ds:schemaRefs>
     <ds:schemaRef ds:uri="http://schemas.openxmlformats.org/officeDocument/2006/bibliography"/>
   </ds:schemaRefs>

</xml_diff>